<commit_message>
Fix review findings: align quarterly rho, Cohen's d, and Discussion P values
- Quarterly Spearman rho: filter quarters with <3 transactions, require >=4
  quarters (matching manuscript logic in write_jca_english.py)
- Cohen's d: read from statistics_summary.csv instead of recomputing, ensuring
  identical values between Table 2 and manuscript text
- Discussion P values: replace hardcoded values with dynamic f-string references
  to computed trend_results and es_comparisons

Co-Authored-By: Tatsuki Onishi <bougtoir@gmail.com>
</commit_message>
<xml_diff>
--- a/vaporizer-price-study/papers/jca_table1.docx
+++ b/vaporizer-price-study/papers/jca_table1.docx
@@ -278,7 +278,7 @@
                 <w:rFonts w:ascii="Times New Roman" w:hAnsi="Times New Roman"/>
                 <w:sz w:val="18"/>
               </w:rPr>
-              <w:t>-0.577</w:t>
+              <w:t>-0.601</w:t>
             </w:r>
           </w:p>
         </w:tc>
@@ -406,7 +406,7 @@
                 <w:rFonts w:ascii="Times New Roman" w:hAnsi="Times New Roman"/>
                 <w:sz w:val="18"/>
               </w:rPr>
-              <w:t>0.144</w:t>
+              <w:t>-0.092</w:t>
             </w:r>
           </w:p>
         </w:tc>
@@ -424,7 +424,7 @@
                 <w:rFonts w:ascii="Times New Roman" w:hAnsi="Times New Roman"/>
                 <w:sz w:val="18"/>
               </w:rPr>
-              <w:t>0.640</w:t>
+              <w:t>0.777</w:t>
             </w:r>
           </w:p>
         </w:tc>

</xml_diff>